<commit_message>
Style advisor-comment revisions: blue text, zero indentation
Mark the four advisor-comment revisions (and the reframed RQ3) in blue so
the updated passages are easy to locate, and set them to zero indentation
(flush at character 0) while matching the document body style (justified
full width, 1.5 line spacing, no extra paragraph spacing). Table of
contents left untouched (static, no new headings added).

Co-Authored-By: Claude Opus 4.8 <noreply@anthropic.com>
Claude-Session: https://claude.ai/code/session_01Nwxz81MD7ef8LEXb3uHzfw
</commit_message>
<xml_diff>
--- a/results/thesis/Aklilu_Gebeyehu_MSc_Thesis_20261023.docx
+++ b/results/thesis/Aklilu_Gebeyehu_MSc_Thesis_20261023.docx
@@ -4027,14 +4027,16 @@
     </w:p>
     <w:p>
       <w:pPr>
-        <w:spacing w:after="60" w:lineRule="auto" w:line="360"/>
-        <w:ind w:firstLine="0" w:left="720"/>
+        <w:spacing w:after="0" w:lineRule="auto" w:line="360" w:before="0"/>
+        <w:ind w:left="0" w:right="0" w:firstLine="0"/>
+        <w:jc w:val="both"/>
       </w:pPr>
       <w:r>
         <w:rPr>
           <w:rFonts w:ascii="Times New Roman" w:hAnsi="Times New Roman"/>
           <w:b w:val="0"/>
           <w:i w:val="0"/>
+          <w:color w:val="0000FF"/>
           <w:sz w:val="24"/>
         </w:rPr>
         <w:t>RQ3: Which machine-learning, deep-learning, or transformer-based model achieves the highest macro-averaged F1 score when classifying sentiment in Amharic social-media text, and what level of accuracy does it attain?</w:t>
@@ -4042,14 +4044,16 @@
     </w:p>
     <w:p>
       <w:pPr>
-        <w:spacing w:after="60" w:lineRule="auto" w:line="360"/>
-        <w:ind w:firstLine="0" w:left="720"/>
+        <w:spacing w:after="0" w:lineRule="auto" w:line="360" w:before="0"/>
+        <w:ind w:left="0" w:right="0" w:firstLine="0"/>
+        <w:jc w:val="both"/>
       </w:pPr>
       <w:r>
         <w:rPr>
           <w:rFonts w:ascii="Times New Roman" w:hAnsi="Times New Roman"/>
           <w:b w:val="0"/>
           <w:i w:val="0"/>
+          <w:color w:val="0000FF"/>
           <w:sz w:val="24"/>
         </w:rPr>
         <w:t>These questions are answered empirically rather than by appeal to the existing literature. RQ1 is addressed through exploratory analysis of the annotated corpus, including class distribution, tweet-length profiles, and the linguistic characteristics reported in Section 4.1. RQ2 is addressed by constructing a reproducible preprocessing pipeline whose individual stages are evaluated for their effect on downstream classification (Sections 3.3 and 4.2). RQ3 is answered through a single controlled comparative experiment: every candidate model is trained on an identical preprocessed training partition and evaluated on one common held-out test partition (n = 1,646) using the same macro-averaged F1 metric, so that any difference in performance is attributable to the model and its feature representation rather than to differences in data or evaluation protocol. The model that attains the highest macro-F1 on that shared test set is identified as the best-performing approach for Amharic policy-domain sentiment. Because no prior study reports such a head-to-head comparison on a common Amharic benchmark, this question cannot be settled from the literature and requires the experimental programme set out in Chapters Three and Four.</w:t>
@@ -6100,7 +6104,7 @@
     <w:p>
       <w:pPr>
         <w:spacing w:lineRule="auto" w:line="360" w:before="0" w:after="0"/>
-        <w:ind w:firstLine="720"/>
+        <w:ind w:left="0" w:right="0" w:firstLine="0"/>
         <w:jc w:val="both"/>
       </w:pPr>
       <w:r>
@@ -6108,6 +6112,7 @@
           <w:rFonts w:ascii="Times New Roman" w:hAnsi="Times New Roman"/>
           <w:b w:val="0"/>
           <w:i w:val="0"/>
+          <w:color w:val="0000FF"/>
           <w:sz w:val="24"/>
         </w:rPr>
         <w:t>Taken together, these gaps define precisely how the present work differs from existing Amharic sentiment research. Where Tessema and Yimam (2021) examined only classical classifiers, Alemayehu et al. (2023) only a CNN-BiLSTM on a single-domain binary political corpus, and Ayele et al. (2023) only fine-tuned XLM-RoBERTa without classical baselines, this study places all of these model families in one controlled comparison on a single standardised benchmark, metric, and preprocessing pipeline. Where prior work defaults to word-level features, this study systematically establishes the superiority of character n-gram representations for Amharic through a 108-experiment ablation. And where high-performing prior systems presuppose GPU hardware and pretrained transformer weights, this study delivers a model that attains comparable macro-F1 under CPU-only constraints. The contribution is therefore not an incremental improvement on a single prior result but a unifying, reproducible comparison that resolves the fragmentation of the existing literature.</w:t>
@@ -6164,7 +6169,7 @@
     <w:p>
       <w:pPr>
         <w:spacing w:lineRule="auto" w:line="360" w:before="0" w:after="0"/>
-        <w:ind w:firstLine="720"/>
+        <w:ind w:left="0" w:right="0" w:firstLine="0"/>
         <w:jc w:val="both"/>
       </w:pPr>
       <w:r>
@@ -6172,6 +6177,7 @@
           <w:rFonts w:ascii="Times New Roman" w:hAnsi="Times New Roman"/>
           <w:b w:val="0"/>
           <w:i w:val="0"/>
+          <w:color w:val="0000FF"/>
           <w:sz w:val="24"/>
         </w:rPr>
         <w:t>Each component is a strict prerequisite for the next, and the order cannot be reversed. Annotation precedes modelling: the sentiment labels are the supervision signal, so a classifier cannot be developed without an annotated corpus — the labels are an input to training, never a product of it. The framework itself is the research design that organises these stages; it is specified in advance and is not a by-product of model development, within which the models are instead instantiated. Evaluation operates on fully trained models: each classifier is first fitted on the training partition and only then applied to the held-out test partition, so performance is measured by comparing a trained model's predictions against known labels, not in the absence of a model. Finally, policy decision support is obtained by applying the selected, trained model to new, unlabelled policy tweets and aggregating its predictions into sentiment trends; the insight derives from the model's outputs on live data, not from the evaluation metrics, which serve only to justify the choice of model. The dependency chain is therefore: annotation → preprocessing → feature extraction → training → evaluation → model selection → deployment on new data → policy insight.</w:t>
@@ -6788,7 +6794,7 @@
     <w:p>
       <w:pPr>
         <w:spacing w:lineRule="auto" w:line="360" w:before="0" w:after="0"/>
-        <w:ind w:firstLine="720"/>
+        <w:ind w:left="0" w:right="0" w:firstLine="0"/>
         <w:jc w:val="both"/>
       </w:pPr>
       <w:r>
@@ -6796,6 +6802,7 @@
           <w:rFonts w:ascii="Times New Roman" w:hAnsi="Times New Roman"/>
           <w:b w:val="0"/>
           <w:i w:val="0"/>
+          <w:color w:val="0000FF"/>
           <w:sz w:val="24"/>
         </w:rPr>
         <w:t>The general value of text preprocessing for natural language processing is well established, and the specific step of Ethiopic character normalisation is documented in prior Amharic work (Yimam et al., 2020); the directional expectation that preprocessing helps can therefore be drawn from the literature. What the literature cannot supply, and what this study establishes empirically, is the quantitative effect of this particular pipeline on this particular corpus. The magnitude of vocabulary reduction and its consequences for TF-IDF feature quality depend on the specific text, and the benefit of each stage differs across feature representations: character-level n-grams are already partly invariant to the orthographic variation that word-level features are not. Section 4.2 therefore reports the measured impact of the pipeline rather than asserting it from prior work, making this measurement a necessary component of the study and not a restatement of established results.</w:t>

</xml_diff>